<commit_message>
Add mixed questions, student notebooks and active study timing; simplify class view
</commit_message>
<xml_diff>
--- a/public/templates/greenedu-cau-hoi-mau.docx
+++ b/public/templates/greenedu-cau-hoi-mau.docx
@@ -31,7 +31,7 @@
         <w:pStyle w:val="ListBullet"/>
       </w:pPr>
       <w:r>
-        <w:t>Thay hai câu mẫu bên dưới bằng câu hỏi của bạn; có thể sao chép thêm khối câu hỏi. Mỗi file từ 1 đến 100 câu, tối đa 5 MB.</w:t>
+        <w:t>Thay các câu mẫu bên dưới bằng câu hỏi của bạn; có thể sao chép thêm khối câu hỏi. Mỗi file từ 1 đến 100 câu, tối đa 5 MB.</w:t>
       </w:r>
     </w:p>
     <w:p>
@@ -39,7 +39,7 @@
         <w:pStyle w:val="ListBullet"/>
       </w:pPr>
       <w:r>
-        <w:t>Mỗi câu bắt đầu bằng Câu 1: (hoặc Câu 2:, Câu 3:…). Giữ các nhãn Bài học:, A., B., C., D., Đáp án: và Lời giải:.</w:t>
+        <w:t>Mỗi câu bắt đầu bằng Câu 1: (hoặc Câu 2:, Câu 3:…). Giữ nhãn Bài học:, Loại câu hỏi:, Đáp án: và Lời giải:.</w:t>
       </w:r>
     </w:p>
     <w:p>
@@ -47,7 +47,7 @@
         <w:pStyle w:val="ListBullet"/>
       </w:pPr>
       <w:r>
-        <w:t>Mỗi câu có bốn phương án khác nhau và một đáp án đúng là A, B, C hoặc D. Điền đủ bài học và lời giải.</w:t>
+        <w:t>Trắc nghiệm: 4 phương án A–D, đáp án A/B/C/D. Đúng/sai: 2–4 ý a–d, đáp án Đ/S theo thứ tự. Trả lời ngắn: không có A–D, ghi trực tiếp đáp án.</w:t>
       </w:r>
     </w:p>
     <w:p>
@@ -87,7 +87,7 @@
         <w:pStyle w:val="Heading1"/>
       </w:pPr>
       <w:r>
-        <w:t>Hai câu mẫu để thay nội dung</w:t>
+        <w:t>Ba dạng câu hỏi để thay nội dung</w:t>
       </w:r>
     </w:p>
     <w:p>
@@ -186,6 +186,76 @@
     <w:p>
       <w:r>
         <w:t>Lời giải: v = s/t = 20/5 = 4 m/s.</w:t>
+      </w:r>
+    </w:p>
+    <w:p>
+      <w:r>
+        <w:t xml:space="preserve">Câu 3: Trái đất là một hành tinh xanh. Xác định tính đúng/sai của các khẳng định.</w:t>
+      </w:r>
+    </w:p>
+    <w:p>
+      <w:r>
+        <w:t xml:space="preserve">Loại câu hỏi: Đúng/sai</w:t>
+      </w:r>
+    </w:p>
+    <w:p>
+      <w:r>
+        <w:t xml:space="preserve">Bài học: Bài 3 · Trái đất</w:t>
+      </w:r>
+    </w:p>
+    <w:p>
+      <w:r>
+        <w:t xml:space="preserve">a. Trái đất gần có dạng hình cầu.</w:t>
+      </w:r>
+    </w:p>
+    <w:p>
+      <w:r>
+        <w:t xml:space="preserve">b. Trái đất có đại dương.</w:t>
+      </w:r>
+    </w:p>
+    <w:p>
+      <w:r>
+        <w:t xml:space="preserve">c. Trái đất là một ngôi sao.</w:t>
+      </w:r>
+    </w:p>
+    <w:p>
+      <w:r>
+        <w:t xml:space="preserve">d. Trái đất quay quanh Mặt trời.</w:t>
+      </w:r>
+    </w:p>
+    <w:p>
+      <w:r>
+        <w:t xml:space="preserve">Đáp án: Đ Đ S Đ</w:t>
+      </w:r>
+    </w:p>
+    <w:p>
+      <w:r>
+        <w:t xml:space="preserve">Lời giải: Trái đất là một hành tinh gần có dạng hình cầu, có đại dương và quay quanh Mặt trời.</w:t>
+      </w:r>
+    </w:p>
+    <w:p>
+      <w:r>
+        <w:t xml:space="preserve">Câu 4: Cho hàm số y = x^3 - 3x^2 + 2. Tìm giá trị cực đại của hàm số.</w:t>
+      </w:r>
+    </w:p>
+    <w:p>
+      <w:r>
+        <w:t xml:space="preserve">Loại câu hỏi: Trả lời ngắn</w:t>
+      </w:r>
+    </w:p>
+    <w:p>
+      <w:r>
+        <w:t xml:space="preserve">Bài học: Bài 4 · Hàm số</w:t>
+      </w:r>
+    </w:p>
+    <w:p>
+      <w:r>
+        <w:t xml:space="preserve">Đáp án: 2</w:t>
+      </w:r>
+    </w:p>
+    <w:p>
+      <w:r>
+        <w:t xml:space="preserve">Lời giải: y' = 3x(x-2). Đạo hàm đổi dấu từ dương sang âm tại x=0, nên giá trị cực đại là y(0)=2.</w:t>
       </w:r>
     </w:p>
     <w:sectPr>

</xml_diff>